<commit_message>
Compromiso Etica - Word y PDF terminado
</commit_message>
<xml_diff>
--- a/webapp/pdf/Otro_Si_Rodamiento.docx
+++ b/webapp/pdf/Otro_Si_Rodamiento.docx
@@ -48,6 +48,270 @@
         <w:rPr>
           <w:rtl w:val="0"/>
         </w:rPr>
+      </w:r>
+    </w:p>
+    <w:p>
+      <w:pPr>
+        <w:spacing w:after="0" w:line="240" w:lineRule="auto"/>
+        <w:jc w:val="both"/>
+        <w:rPr>
+          <w:rFonts w:ascii="Arial" w:cs="Arial" w:eastAsia="Arial" w:hAnsi="Arial"/>
+          <w:sz w:val="24"/>
+          <w:szCs w:val="24"/>
+        </w:rPr>
+      </w:pPr>
+      <w:r>
+        <w:rPr>
+          <w:rtl w:val="0"/>
+        </w:rPr>
+      </w:r>
+    </w:p>
+    <w:p>
+      <w:pPr>
+        <w:rPr>
+          <w:rFonts w:ascii="Arial" w:cs="Arial" w:eastAsia="Arial" w:hAnsi="Arial"/>
+          <w:sz w:val="24"/>
+          <w:szCs w:val="24"/>
+          <w:vertAlign w:val="baseline"/>
+        </w:rPr>
+      </w:pPr>
+      <w:r>
+        <w:rPr>
+          <w:rFonts w:ascii="Arial" w:cs="Arial" w:eastAsia="Arial" w:hAnsi="Arial"/>
+          <w:sz w:val="24"/>
+          <w:szCs w:val="24"/>
+          <w:highlight w:val="lightGray"/>
+          <w:vertAlign w:val="baseline"/>
+          <w:rtl w:val="0"/>
+        </w:rPr>
+        <w:t xml:space="preserve">Siendo,el veinte de diciembre de 2023, se reunieron por una parte</w:t>
+      </w:r>
+      <w:r>
+        <w:rPr>
+          <w:rFonts w:ascii="Arial" w:cs="Arial" w:eastAsia="Arial" w:hAnsi="Arial"/>
+          <w:sz w:val="24"/>
+          <w:szCs w:val="24"/>
+          <w:vertAlign w:val="baseline"/>
+          <w:rtl w:val="0"/>
+        </w:rPr>
+        <w:t xml:space="preserve"> </w:t>
+      </w:r>
+      <w:r>
+        <w:rPr>
+          <w:rFonts w:ascii="Arial" w:cs="Arial" w:eastAsia="Arial" w:hAnsi="Arial"/>
+          <w:b w:val="1"/>
+          <w:bCs w:val="1"/>
+          <w:sz w:val="24"/>
+          <w:szCs w:val="24"/>
+          <w:rtl w:val="0"/>
+        </w:rPr>
+        <w:t xml:space="preserve">[[Nombre]]</w:t>
+      </w:r>
+      <w:r>
+        <w:rPr>
+          <w:rFonts w:ascii="Arial" w:cs="Arial" w:eastAsia="Arial" w:hAnsi="Arial"/>
+          <w:sz w:val="24"/>
+          <w:szCs w:val="24"/>
+          <w:rtl w:val="0"/>
+        </w:rPr>
+        <w:t xml:space="preserve"> </w:t>
+      </w:r>
+      <w:r>
+        <w:rPr>
+          <w:rFonts w:ascii="Arial" w:cs="Arial" w:eastAsia="Arial" w:hAnsi="Arial"/>
+          <w:sz w:val="24"/>
+          <w:szCs w:val="24"/>
+          <w:vertAlign w:val="baseline"/>
+          <w:rtl w:val="0"/>
+        </w:rPr>
+        <w:t xml:space="preserve">identificado (a) </w:t>
+      </w:r>
+      <w:r>
+        <w:rPr>
+          <w:rFonts w:ascii="Arial" w:cs="Arial" w:eastAsia="Arial" w:hAnsi="Arial"/>
+          <w:b w:val="1"/>
+          <w:bCs w:val="1"/>
+          <w:sz w:val="24"/>
+          <w:szCs w:val="24"/>
+          <w:rtl w:val="0"/>
+        </w:rPr>
+        <w:t xml:space="preserve">[[Cedula]]</w:t>
+      </w:r>
+      <w:r>
+        <w:rPr>
+          <w:rFonts w:ascii="Arial" w:cs="Arial" w:eastAsia="Arial" w:hAnsi="Arial"/>
+          <w:sz w:val="24"/>
+          <w:szCs w:val="24"/>
+          <w:rtl w:val="0"/>
+        </w:rPr>
+        <w:t xml:space="preserve"> </w:t>
+      </w:r>
+      <w:r>
+        <w:rPr>
+          <w:rFonts w:ascii="Arial" w:cs="Arial" w:eastAsia="Arial" w:hAnsi="Arial"/>
+          <w:sz w:val="24"/>
+          <w:szCs w:val="24"/>
+          <w:vertAlign w:val="baseline"/>
+          <w:rtl w:val="0"/>
+        </w:rPr>
+        <w:t xml:space="preserve">como aparece al pie de su firma y quien adelante se denominará EL TRABAJADOR, y por la otra, LAURA CRISTINA CERÓN MUÑOZ identificada con la C.C. No. 52.705.312 y quien actúa en representación de DIACO S.A., quien en adelante se denominará EL EMPLEADOR, con el fin de suscribir un acuerdo provisto de las siguientes cláusulas.</w:t>
+      </w:r>
+    </w:p>
+    <w:p>
+      <w:pPr>
+        <w:spacing w:after="0" w:line="240" w:lineRule="auto"/>
+        <w:jc w:val="both"/>
+        <w:rPr>
+          <w:rFonts w:ascii="Arial" w:cs="Arial" w:eastAsia="Arial" w:hAnsi="Arial"/>
+          <w:sz w:val="24"/>
+          <w:szCs w:val="24"/>
+        </w:rPr>
+      </w:pPr>
+      <w:r>
+        <w:rPr>
+          <w:rtl w:val="0"/>
+        </w:rPr>
+      </w:r>
+    </w:p>
+    <w:p>
+      <w:pPr>
+        <w:spacing w:after="0" w:line="240" w:lineRule="auto"/>
+        <w:jc w:val="both"/>
+        <w:rPr>
+          <w:rFonts w:ascii="Arial" w:cs="Arial" w:eastAsia="Arial" w:hAnsi="Arial"/>
+          <w:sz w:val="24"/>
+          <w:szCs w:val="24"/>
+        </w:rPr>
+      </w:pPr>
+      <w:r>
+        <w:rPr>
+          <w:rFonts w:ascii="Arial" w:cs="Arial" w:eastAsia="Arial" w:hAnsi="Arial"/>
+          <w:b w:val="1"/>
+          <w:bCs w:val="1"/>
+          <w:sz w:val="24"/>
+          <w:szCs w:val="24"/>
+          <w:rtl w:val="0"/>
+        </w:rPr>
+        <w:t xml:space="preserve">PRIMERA:</w:t>
+      </w:r>
+      <w:r>
+        <w:rPr>
+          <w:rFonts w:ascii="Arial" w:cs="Arial" w:eastAsia="Arial" w:hAnsi="Arial"/>
+          <w:sz w:val="24"/>
+          <w:szCs w:val="24"/>
+          <w:rtl w:val="0"/>
+        </w:rPr>
+        <w:t xml:space="preserve"> EL EMPLEADOR por mera liberalidad, en consideración a la necesidad que tiene EL TRABAJADOR de desplazarse a diferentes lugares en virtud del cargo que desempeña, y con el objeto de proporcionar un instrumento que le permita cumplir los fines de su cargo, otorga a EL TRABAJADOR un auxilio de trasporte extralegal.</w:t>
+      </w:r>
+    </w:p>
+    <w:p>
+      <w:pPr>
+        <w:spacing w:after="0" w:line="240" w:lineRule="auto"/>
+        <w:jc w:val="both"/>
+        <w:rPr>
+          <w:rFonts w:ascii="Arial" w:cs="Arial" w:eastAsia="Arial" w:hAnsi="Arial"/>
+          <w:sz w:val="24"/>
+          <w:szCs w:val="24"/>
+        </w:rPr>
+      </w:pPr>
+      <w:r>
+        <w:rPr>
+          <w:rtl w:val="0"/>
+        </w:rPr>
+      </w:r>
+    </w:p>
+    <w:p>
+      <w:pPr>
+        <w:spacing w:after="0" w:line="240" w:lineRule="auto"/>
+        <w:jc w:val="both"/>
+        <w:rPr>
+          <w:rFonts w:ascii="Arial" w:cs="Arial" w:eastAsia="Arial" w:hAnsi="Arial"/>
+          <w:b w:val="1"/>
+          <w:bCs w:val="1"/>
+          <w:sz w:val="24"/>
+          <w:szCs w:val="24"/>
+        </w:rPr>
+      </w:pPr>
+      <w:r>
+        <w:rPr>
+          <w:rFonts w:ascii="Arial" w:cs="Arial" w:eastAsia="Arial" w:hAnsi="Arial"/>
+          <w:sz w:val="24"/>
+          <w:szCs w:val="24"/>
+          <w:rtl w:val="0"/>
+        </w:rPr>
+        <w:t xml:space="preserve">En consecuencia, de lo anterior, las partes han convenido que EL TRABAJADOR reciba un valor de </w:t>
+      </w:r>
+      <w:r>
+        <w:rPr>
+          <w:rFonts w:ascii="Arial" w:cs="Arial" w:eastAsia="Arial" w:hAnsi="Arial"/>
+          <w:b w:val="1"/>
+          <w:bCs w:val="1"/>
+          <w:sz w:val="24"/>
+          <w:szCs w:val="24"/>
+          <w:rtl w:val="0"/>
+        </w:rPr>
+        <w:t xml:space="preserve">UN MILLÓN CUATROCIENTOS SETENTA Y UN MIL DOCIENTOS SESENTA Y SIETE PESOS M/CTE ($1.471.267), </w:t>
+      </w:r>
+      <w:r>
+        <w:rPr>
+          <w:rFonts w:ascii="Arial" w:cs="Arial" w:eastAsia="Arial" w:hAnsi="Arial"/>
+          <w:sz w:val="24"/>
+          <w:szCs w:val="24"/>
+          <w:rtl w:val="0"/>
+        </w:rPr>
+        <w:t xml:space="preserve">como monto fijo mensual que será consignado a la cuenta de nómina del colaborador, con el ánimo de reintegrar al trabajador el dinero que gaste en su movilización para la realización del cargo que desempeña en Diaco S.A.</w:t>
+      </w:r>
+      <w:r>
+        <w:rPr>
+          <w:rtl w:val="0"/>
+        </w:rPr>
+      </w:r>
+    </w:p>
+    <w:p>
+      <w:pPr>
+        <w:spacing w:after="0" w:line="240" w:lineRule="auto"/>
+        <w:jc w:val="both"/>
+        <w:rPr>
+          <w:rFonts w:ascii="Arial" w:cs="Arial" w:eastAsia="Arial" w:hAnsi="Arial"/>
+          <w:sz w:val="24"/>
+          <w:szCs w:val="24"/>
+        </w:rPr>
+      </w:pPr>
+      <w:r>
+        <w:rPr>
+          <w:rtl w:val="0"/>
+        </w:rPr>
+      </w:r>
+    </w:p>
+    <w:p>
+      <w:pPr>
+        <w:spacing w:after="0" w:line="240" w:lineRule="auto"/>
+        <w:jc w:val="both"/>
+        <w:rPr>
+          <w:rFonts w:ascii="Arial" w:cs="Arial" w:eastAsia="Arial" w:hAnsi="Arial"/>
+          <w:sz w:val="24"/>
+          <w:szCs w:val="24"/>
+        </w:rPr>
+      </w:pPr>
+      <w:r>
+        <w:rPr>
+          <w:rFonts w:ascii="Arial" w:cs="Arial" w:eastAsia="Arial" w:hAnsi="Arial"/>
+          <w:b w:val="1"/>
+          <w:bCs w:val="1"/>
+          <w:sz w:val="24"/>
+          <w:szCs w:val="24"/>
+          <w:rtl w:val="0"/>
+        </w:rPr>
+        <w:t xml:space="preserve">SEGUNDA:</w:t>
+      </w:r>
+      <w:r>
+        <w:rPr>
+          <w:rFonts w:ascii="Arial" w:cs="Arial" w:eastAsia="Arial" w:hAnsi="Arial"/>
+          <w:sz w:val="24"/>
+          <w:szCs w:val="24"/>
+          <w:rtl w:val="0"/>
+        </w:rPr>
+        <w:t xml:space="preserve"> Las partes convienen y así lo hacen constar que el beneficio extralegal que mediante este acuerdo se otorga, no constituye salario para ningún efecto legal conforme a lo estipulado en el artículo 15 de la Ley 50 de 1990, en tanto constituye un auxilio de trasporte que no tiene por finalidad retribuir de manera directa el servicio prestado por el trabajador. </w:t>
       </w:r>
     </w:p>
     <w:p>
@@ -84,64 +348,23 @@
         <w:ind w:left="0" w:right="0" w:firstLine="0"/>
         <w:jc w:val="both"/>
         <w:rPr>
-          <w:rFonts w:ascii="Consolas" w:cs="Consolas" w:eastAsia="Consolas" w:hAnsi="Consolas"/>
-          <w:b w:val="1"/>
-          <w:bCs w:val="1"/>
-          <w:sz w:val="21"/>
-          <w:szCs w:val="21"/>
-        </w:rPr>
-      </w:pPr>
-      <w:r>
-        <w:rPr>
-          <w:rFonts w:ascii="Arial" w:cs="Arial" w:eastAsia="Arial" w:hAnsi="Arial"/>
-          <w:b w:val="0"/>
-          <w:bCs w:val="0"/>
+          <w:rFonts w:ascii="Arial" w:cs="Arial" w:eastAsia="Arial" w:hAnsi="Arial"/>
           <w:i w:val="0"/>
           <w:iCs w:val="0"/>
           <w:smallCaps w:val="0"/>
           <w:strike w:val="0"/>
           <w:sz w:val="24"/>
           <w:szCs w:val="24"/>
-          <w:highlight w:val="lightGray"/>
           <w:u w:val="none"/>
-          <w:vertAlign w:val="baseline"/>
-          <w:rtl w:val="0"/>
-        </w:rPr>
-        <w:t xml:space="preserve">Siendo, el veinte de diciembre de 2023, se reunieron por una parte </w:t>
-      </w:r>
-      <w:r>
-        <w:rPr>
-          <w:rFonts w:ascii="Consolas" w:cs="Consolas" w:eastAsia="Consolas" w:hAnsi="Consolas"/>
-          <w:b w:val="1"/>
-          <w:bCs w:val="1"/>
-          <w:sz w:val="21"/>
-          <w:szCs w:val="21"/>
-          <w:rtl w:val="0"/>
-        </w:rPr>
-        <w:t xml:space="preserve">[[Nombre]]</w:t>
-      </w:r>
-    </w:p>
-    <w:p>
-      <w:pPr>
-        <w:keepNext w:val="0"/>
-        <w:keepLines w:val="0"/>
-        <w:pageBreakBefore w:val="0"/>
-        <w:widowControl w:val="1"/>
-        <w:pBdr>
-          <w:top w:space="0" w:sz="0" w:val="nil"/>
-          <w:left w:space="0" w:sz="0" w:val="nil"/>
-          <w:bottom w:space="0" w:sz="0" w:val="nil"/>
-          <w:right w:space="0" w:sz="0" w:val="nil"/>
-          <w:between w:space="0" w:sz="0" w:val="nil"/>
-        </w:pBdr>
-        <w:shd w:fill="auto" w:val="clear"/>
-        <w:spacing w:after="0" w:before="0" w:line="240" w:lineRule="auto"/>
-        <w:ind w:left="0" w:right="0" w:firstLine="0"/>
-        <w:jc w:val="both"/>
-        <w:rPr>
-          <w:rFonts w:ascii="Arial" w:cs="Arial" w:eastAsia="Arial" w:hAnsi="Arial"/>
-          <w:b w:val="0"/>
-          <w:bCs w:val="0"/>
+          <w:shd w:fill="auto" w:val="clear"/>
+          <w:vertAlign w:val="baseline"/>
+        </w:rPr>
+      </w:pPr>
+      <w:r>
+        <w:rPr>
+          <w:rFonts w:ascii="Arial" w:cs="Arial" w:eastAsia="Arial" w:hAnsi="Arial"/>
+          <w:b w:val="1"/>
+          <w:bCs w:val="1"/>
           <w:i w:val="0"/>
           <w:iCs w:val="0"/>
           <w:smallCaps w:val="0"/>
@@ -151,13 +374,13 @@
           <w:u w:val="none"/>
           <w:shd w:fill="auto" w:val="clear"/>
           <w:vertAlign w:val="baseline"/>
-        </w:rPr>
-      </w:pPr>
-      <w:r>
-        <w:rPr>
-          <w:rFonts w:ascii="Arial" w:cs="Arial" w:eastAsia="Arial" w:hAnsi="Arial"/>
-          <w:b w:val="0"/>
-          <w:bCs w:val="0"/>
+          <w:rtl w:val="0"/>
+        </w:rPr>
+        <w:t xml:space="preserve">TERCERA:</w:t>
+      </w:r>
+      <w:r>
+        <w:rPr>
+          <w:rFonts w:ascii="Arial" w:cs="Arial" w:eastAsia="Arial" w:hAnsi="Arial"/>
           <w:i w:val="0"/>
           <w:iCs w:val="0"/>
           <w:smallCaps w:val="0"/>
@@ -169,117 +392,7 @@
           <w:vertAlign w:val="baseline"/>
           <w:rtl w:val="0"/>
         </w:rPr>
-        <w:t xml:space="preserve">identificado (a) </w:t>
-      </w:r>
-      <w:r>
-        <w:rPr>
-          <w:rFonts w:ascii="Consolas" w:cs="Consolas" w:eastAsia="Consolas" w:hAnsi="Consolas"/>
-          <w:b w:val="1"/>
-          <w:bCs w:val="1"/>
-          <w:sz w:val="21"/>
-          <w:szCs w:val="21"/>
-          <w:rtl w:val="0"/>
-        </w:rPr>
-        <w:t xml:space="preserve">[[Cedula]]</w:t>
-      </w:r>
-      <w:r>
-        <w:rPr>
-          <w:rFonts w:ascii="Consolas" w:cs="Consolas" w:eastAsia="Consolas" w:hAnsi="Consolas"/>
-          <w:sz w:val="21"/>
-          <w:szCs w:val="21"/>
-          <w:rtl w:val="0"/>
-        </w:rPr>
-        <w:t xml:space="preserve"> </w:t>
-      </w:r>
-      <w:r>
-        <w:rPr>
-          <w:rFonts w:ascii="Arial" w:cs="Arial" w:eastAsia="Arial" w:hAnsi="Arial"/>
-          <w:b w:val="0"/>
-          <w:bCs w:val="0"/>
-          <w:i w:val="0"/>
-          <w:iCs w:val="0"/>
-          <w:smallCaps w:val="0"/>
-          <w:strike w:val="0"/>
-          <w:sz w:val="24"/>
-          <w:szCs w:val="24"/>
-          <w:u w:val="none"/>
-          <w:shd w:fill="auto" w:val="clear"/>
-          <w:vertAlign w:val="baseline"/>
-          <w:rtl w:val="0"/>
-        </w:rPr>
-        <w:t xml:space="preserve">como aparece al pie de su firma y quien adelante se denominará EL TRABAJADOR, y por la otra, </w:t>
-      </w:r>
-      <w:r>
-        <w:rPr>
-          <w:rFonts w:ascii="Arial" w:cs="Arial" w:eastAsia="Arial" w:hAnsi="Arial"/>
-          <w:b w:val="1"/>
-          <w:bCs w:val="1"/>
-          <w:i w:val="0"/>
-          <w:iCs w:val="0"/>
-          <w:smallCaps w:val="0"/>
-          <w:strike w:val="0"/>
-          <w:sz w:val="24"/>
-          <w:szCs w:val="24"/>
-          <w:u w:val="none"/>
-          <w:shd w:fill="auto" w:val="clear"/>
-          <w:vertAlign w:val="baseline"/>
-          <w:rtl w:val="0"/>
-        </w:rPr>
-        <w:t xml:space="preserve">LAURA CRISTINA CERÓN MUÑOZ</w:t>
-      </w:r>
-      <w:r>
-        <w:rPr>
-          <w:rFonts w:ascii="Arial" w:cs="Arial" w:eastAsia="Arial" w:hAnsi="Arial"/>
-          <w:b w:val="0"/>
-          <w:bCs w:val="0"/>
-          <w:i w:val="0"/>
-          <w:iCs w:val="0"/>
-          <w:smallCaps w:val="0"/>
-          <w:strike w:val="0"/>
-          <w:sz w:val="24"/>
-          <w:szCs w:val="24"/>
-          <w:u w:val="none"/>
-          <w:shd w:fill="auto" w:val="clear"/>
-          <w:vertAlign w:val="baseline"/>
-          <w:rtl w:val="0"/>
-        </w:rPr>
-        <w:t xml:space="preserve"> identificada con la C.C. No. 52.705.312 y quien actúa en representación de </w:t>
-      </w:r>
-      <w:r>
-        <w:rPr>
-          <w:rFonts w:ascii="Arial" w:cs="Arial" w:eastAsia="Arial" w:hAnsi="Arial"/>
-          <w:b w:val="1"/>
-          <w:bCs w:val="1"/>
-          <w:i w:val="0"/>
-          <w:iCs w:val="0"/>
-          <w:smallCaps w:val="0"/>
-          <w:strike w:val="0"/>
-          <w:sz w:val="24"/>
-          <w:szCs w:val="24"/>
-          <w:u w:val="none"/>
-          <w:shd w:fill="auto" w:val="clear"/>
-          <w:vertAlign w:val="baseline"/>
-          <w:rtl w:val="0"/>
-        </w:rPr>
-        <w:t xml:space="preserve">DIACO S.A.,</w:t>
-      </w:r>
-      <w:r>
-        <w:rPr>
-          <w:rFonts w:ascii="Arial" w:cs="Arial" w:eastAsia="Arial" w:hAnsi="Arial"/>
-          <w:b w:val="0"/>
-          <w:bCs w:val="0"/>
-          <w:i w:val="0"/>
-          <w:iCs w:val="0"/>
-          <w:smallCaps w:val="0"/>
-          <w:strike w:val="0"/>
-          <w:sz w:val="24"/>
-          <w:szCs w:val="24"/>
-          <w:u w:val="none"/>
-          <w:shd w:fill="auto" w:val="clear"/>
-          <w:vertAlign w:val="baseline"/>
-          <w:rtl w:val="0"/>
-        </w:rPr>
-        <w:t xml:space="preserve"> quien en adelante se denominará EL EMPLEADOR, con el fin de suscribir un acuerdo provisto de las siguientes cláusulas.</w:t>
+        <w:t xml:space="preserve"> Las partes declaran y así lo hacen constar que el presente beneficio, en tanto deriva de la mera liberalidad del EL EMPLEADOR, podrá ser modificado o eliminado de manera unilateral por EL EMPLEADOR cuando las necesidades así lo ameriten, sin que por ello se entienda desmejora en las condiciones del trabajador.</w:t>
       </w:r>
     </w:p>
     <w:p>
@@ -311,248 +424,6 @@
       <w:r>
         <w:rPr>
           <w:rFonts w:ascii="Arial" w:cs="Arial" w:eastAsia="Arial" w:hAnsi="Arial"/>
-          <w:b w:val="1"/>
-          <w:bCs w:val="1"/>
-          <w:sz w:val="24"/>
-          <w:szCs w:val="24"/>
-          <w:rtl w:val="0"/>
-        </w:rPr>
-        <w:t xml:space="preserve">PRIMERA:</w:t>
-      </w:r>
-      <w:r>
-        <w:rPr>
-          <w:rFonts w:ascii="Arial" w:cs="Arial" w:eastAsia="Arial" w:hAnsi="Arial"/>
-          <w:sz w:val="24"/>
-          <w:szCs w:val="24"/>
-          <w:rtl w:val="0"/>
-        </w:rPr>
-        <w:t xml:space="preserve"> EL EMPLEADOR por mera liberalidad, en consideración a la necesidad que tiene EL TRABAJADOR de desplazarse a diferentes lugares en virtud del cargo que desempeña, y con el objeto de proporcionar un instrumento que le permita cumplir los fines de su cargo, otorga a EL TRABAJADOR un auxilio de trasporte extralegal.</w:t>
-      </w:r>
-    </w:p>
-    <w:p>
-      <w:pPr>
-        <w:spacing w:after="0" w:line="240" w:lineRule="auto"/>
-        <w:jc w:val="both"/>
-        <w:rPr>
-          <w:rFonts w:ascii="Arial" w:cs="Arial" w:eastAsia="Arial" w:hAnsi="Arial"/>
-          <w:sz w:val="24"/>
-          <w:szCs w:val="24"/>
-        </w:rPr>
-      </w:pPr>
-      <w:r>
-        <w:rPr>
-          <w:rtl w:val="0"/>
-        </w:rPr>
-      </w:r>
-    </w:p>
-    <w:p>
-      <w:pPr>
-        <w:spacing w:after="0" w:line="240" w:lineRule="auto"/>
-        <w:jc w:val="both"/>
-        <w:rPr>
-          <w:rFonts w:ascii="Arial" w:cs="Arial" w:eastAsia="Arial" w:hAnsi="Arial"/>
-          <w:b w:val="1"/>
-          <w:bCs w:val="1"/>
-          <w:sz w:val="24"/>
-          <w:szCs w:val="24"/>
-        </w:rPr>
-      </w:pPr>
-      <w:r>
-        <w:rPr>
-          <w:rFonts w:ascii="Arial" w:cs="Arial" w:eastAsia="Arial" w:hAnsi="Arial"/>
-          <w:sz w:val="24"/>
-          <w:szCs w:val="24"/>
-          <w:rtl w:val="0"/>
-        </w:rPr>
-        <w:t xml:space="preserve">En consecuencia, de lo anterior, las partes han convenido que EL TRABAJADOR reciba un valor de </w:t>
-      </w:r>
-      <w:r>
-        <w:rPr>
-          <w:rFonts w:ascii="Arial" w:cs="Arial" w:eastAsia="Arial" w:hAnsi="Arial"/>
-          <w:b w:val="1"/>
-          <w:bCs w:val="1"/>
-          <w:sz w:val="24"/>
-          <w:szCs w:val="24"/>
-          <w:rtl w:val="0"/>
-        </w:rPr>
-        <w:t xml:space="preserve">UN MILLÓN CUATROCIENTOS SETENTA Y UN MIL DOCIENTOS SESENTA Y SIETE PESOS M/CTE ($1.471.267), </w:t>
-      </w:r>
-      <w:r>
-        <w:rPr>
-          <w:rFonts w:ascii="Arial" w:cs="Arial" w:eastAsia="Arial" w:hAnsi="Arial"/>
-          <w:sz w:val="24"/>
-          <w:szCs w:val="24"/>
-          <w:rtl w:val="0"/>
-        </w:rPr>
-        <w:t xml:space="preserve">como monto fijo mensual que será consignado a la cuenta de nómina del colaborador, con el ánimo de reintegrar al trabajador el dinero que gaste en su movilización para la realización del cargo que desempeña en Diaco S.A.</w:t>
-      </w:r>
-      <w:r>
-        <w:rPr>
-          <w:rtl w:val="0"/>
-        </w:rPr>
-      </w:r>
-    </w:p>
-    <w:p>
-      <w:pPr>
-        <w:spacing w:after="0" w:line="240" w:lineRule="auto"/>
-        <w:jc w:val="both"/>
-        <w:rPr>
-          <w:rFonts w:ascii="Arial" w:cs="Arial" w:eastAsia="Arial" w:hAnsi="Arial"/>
-          <w:sz w:val="24"/>
-          <w:szCs w:val="24"/>
-        </w:rPr>
-      </w:pPr>
-      <w:r>
-        <w:rPr>
-          <w:rtl w:val="0"/>
-        </w:rPr>
-      </w:r>
-    </w:p>
-    <w:p>
-      <w:pPr>
-        <w:spacing w:after="0" w:line="240" w:lineRule="auto"/>
-        <w:jc w:val="both"/>
-        <w:rPr>
-          <w:rFonts w:ascii="Arial" w:cs="Arial" w:eastAsia="Arial" w:hAnsi="Arial"/>
-          <w:sz w:val="24"/>
-          <w:szCs w:val="24"/>
-        </w:rPr>
-      </w:pPr>
-      <w:r>
-        <w:rPr>
-          <w:rFonts w:ascii="Arial" w:cs="Arial" w:eastAsia="Arial" w:hAnsi="Arial"/>
-          <w:b w:val="1"/>
-          <w:bCs w:val="1"/>
-          <w:sz w:val="24"/>
-          <w:szCs w:val="24"/>
-          <w:rtl w:val="0"/>
-        </w:rPr>
-        <w:t xml:space="preserve">SEGUNDA:</w:t>
-      </w:r>
-      <w:r>
-        <w:rPr>
-          <w:rFonts w:ascii="Arial" w:cs="Arial" w:eastAsia="Arial" w:hAnsi="Arial"/>
-          <w:sz w:val="24"/>
-          <w:szCs w:val="24"/>
-          <w:rtl w:val="0"/>
-        </w:rPr>
-        <w:t xml:space="preserve"> Las partes convienen y así lo hacen constar que el beneficio extralegal que mediante este acuerdo se otorga, no constituye salario para ningún efecto legal conforme a lo estipulado en el artículo 15 de la Ley 50 de 1990, en tanto constituye un auxilio de trasporte que no tiene por finalidad retribuir de manera directa el servicio prestado por el trabajador. </w:t>
-      </w:r>
-    </w:p>
-    <w:p>
-      <w:pPr>
-        <w:spacing w:after="0" w:line="240" w:lineRule="auto"/>
-        <w:jc w:val="both"/>
-        <w:rPr>
-          <w:rFonts w:ascii="Arial" w:cs="Arial" w:eastAsia="Arial" w:hAnsi="Arial"/>
-          <w:sz w:val="24"/>
-          <w:szCs w:val="24"/>
-        </w:rPr>
-      </w:pPr>
-      <w:r>
-        <w:rPr>
-          <w:rtl w:val="0"/>
-        </w:rPr>
-      </w:r>
-    </w:p>
-    <w:p>
-      <w:pPr>
-        <w:keepNext w:val="0"/>
-        <w:keepLines w:val="0"/>
-        <w:pageBreakBefore w:val="0"/>
-        <w:widowControl w:val="1"/>
-        <w:pBdr>
-          <w:top w:space="0" w:sz="0" w:val="nil"/>
-          <w:left w:space="0" w:sz="0" w:val="nil"/>
-          <w:bottom w:space="0" w:sz="0" w:val="nil"/>
-          <w:right w:space="0" w:sz="0" w:val="nil"/>
-          <w:between w:space="0" w:sz="0" w:val="nil"/>
-        </w:pBdr>
-        <w:shd w:fill="auto" w:val="clear"/>
-        <w:spacing w:after="0" w:before="0" w:line="240" w:lineRule="auto"/>
-        <w:ind w:left="0" w:right="0" w:firstLine="0"/>
-        <w:jc w:val="both"/>
-        <w:rPr>
-          <w:rFonts w:ascii="Arial" w:cs="Arial" w:eastAsia="Arial" w:hAnsi="Arial"/>
-          <w:b w:val="0"/>
-          <w:bCs w:val="0"/>
-          <w:i w:val="0"/>
-          <w:iCs w:val="0"/>
-          <w:smallCaps w:val="0"/>
-          <w:strike w:val="0"/>
-          <w:sz w:val="24"/>
-          <w:szCs w:val="24"/>
-          <w:u w:val="none"/>
-          <w:shd w:fill="auto" w:val="clear"/>
-          <w:vertAlign w:val="baseline"/>
-        </w:rPr>
-      </w:pPr>
-      <w:r>
-        <w:rPr>
-          <w:rFonts w:ascii="Arial" w:cs="Arial" w:eastAsia="Arial" w:hAnsi="Arial"/>
-          <w:b w:val="1"/>
-          <w:bCs w:val="1"/>
-          <w:i w:val="0"/>
-          <w:iCs w:val="0"/>
-          <w:smallCaps w:val="0"/>
-          <w:strike w:val="0"/>
-          <w:sz w:val="24"/>
-          <w:szCs w:val="24"/>
-          <w:u w:val="none"/>
-          <w:shd w:fill="auto" w:val="clear"/>
-          <w:vertAlign w:val="baseline"/>
-          <w:rtl w:val="0"/>
-        </w:rPr>
-        <w:t xml:space="preserve">TERCERA:</w:t>
-      </w:r>
-      <w:r>
-        <w:rPr>
-          <w:rFonts w:ascii="Arial" w:cs="Arial" w:eastAsia="Arial" w:hAnsi="Arial"/>
-          <w:b w:val="0"/>
-          <w:bCs w:val="0"/>
-          <w:i w:val="0"/>
-          <w:iCs w:val="0"/>
-          <w:smallCaps w:val="0"/>
-          <w:strike w:val="0"/>
-          <w:sz w:val="24"/>
-          <w:szCs w:val="24"/>
-          <w:u w:val="none"/>
-          <w:shd w:fill="auto" w:val="clear"/>
-          <w:vertAlign w:val="baseline"/>
-          <w:rtl w:val="0"/>
-        </w:rPr>
-        <w:t xml:space="preserve"> Las partes declaran y así lo hacen constar que el presente beneficio, en tanto deriva de la mera liberalidad del EL EMPLEADOR, podrá ser modificado o eliminado de manera unilateral por EL EMPLEADOR cuando las necesidades así lo ameriten, sin que por ello se entienda desmejora en las condiciones del trabajador.</w:t>
-      </w:r>
-    </w:p>
-    <w:p>
-      <w:pPr>
-        <w:spacing w:after="0" w:line="240" w:lineRule="auto"/>
-        <w:jc w:val="both"/>
-        <w:rPr>
-          <w:rFonts w:ascii="Arial" w:cs="Arial" w:eastAsia="Arial" w:hAnsi="Arial"/>
-          <w:sz w:val="24"/>
-          <w:szCs w:val="24"/>
-        </w:rPr>
-      </w:pPr>
-      <w:r>
-        <w:rPr>
-          <w:rtl w:val="0"/>
-        </w:rPr>
-      </w:r>
-    </w:p>
-    <w:p>
-      <w:pPr>
-        <w:spacing w:after="0" w:line="240" w:lineRule="auto"/>
-        <w:jc w:val="both"/>
-        <w:rPr>
-          <w:rFonts w:ascii="Arial" w:cs="Arial" w:eastAsia="Arial" w:hAnsi="Arial"/>
-          <w:sz w:val="24"/>
-          <w:szCs w:val="24"/>
-        </w:rPr>
-      </w:pPr>
-      <w:r>
-        <w:rPr>
-          <w:rFonts w:ascii="Arial" w:cs="Arial" w:eastAsia="Arial" w:hAnsi="Arial"/>
           <w:sz w:val="24"/>
           <w:szCs w:val="24"/>
           <w:rtl w:val="0"/>
@@ -561,11 +432,11 @@
       </w:r>
       <w:r>
         <w:rPr>
-          <w:rFonts w:ascii="Consolas" w:cs="Consolas" w:eastAsia="Consolas" w:hAnsi="Consolas"/>
-          <w:b w:val="1"/>
-          <w:bCs w:val="1"/>
-          <w:sz w:val="21"/>
-          <w:szCs w:val="21"/>
+          <w:rFonts w:ascii="Arial" w:cs="Arial" w:eastAsia="Arial" w:hAnsi="Arial"/>
+          <w:b w:val="1"/>
+          <w:bCs w:val="1"/>
+          <w:sz w:val="24"/>
+          <w:szCs w:val="24"/>
           <w:rtl w:val="0"/>
         </w:rPr>
         <w:t xml:space="preserve">[[CiudadWork]]</w:t>
@@ -581,11 +452,11 @@
       </w:r>
       <w:r>
         <w:rPr>
-          <w:rFonts w:ascii="Consolas" w:cs="Consolas" w:eastAsia="Consolas" w:hAnsi="Consolas"/>
-          <w:b w:val="1"/>
-          <w:bCs w:val="1"/>
-          <w:sz w:val="21"/>
-          <w:szCs w:val="21"/>
+          <w:rFonts w:ascii="Arial" w:cs="Arial" w:eastAsia="Arial" w:hAnsi="Arial"/>
+          <w:b w:val="1"/>
+          <w:bCs w:val="1"/>
+          <w:sz w:val="24"/>
+          <w:szCs w:val="24"/>
           <w:rtl w:val="0"/>
         </w:rPr>
         <w:t xml:space="preserve">[[FechaCert]]</w:t>
@@ -654,8 +525,6 @@
         <w:jc w:val="left"/>
         <w:rPr>
           <w:rFonts w:ascii="Arial" w:cs="Arial" w:eastAsia="Arial" w:hAnsi="Arial"/>
-          <w:b w:val="0"/>
-          <w:bCs w:val="0"/>
           <w:i w:val="0"/>
           <w:iCs w:val="0"/>
           <w:smallCaps w:val="0"/>
@@ -837,8 +706,6 @@
         <w:jc w:val="left"/>
         <w:rPr>
           <w:rFonts w:ascii="Arial" w:cs="Arial" w:eastAsia="Arial" w:hAnsi="Arial"/>
-          <w:b w:val="0"/>
-          <w:bCs w:val="0"/>
           <w:i w:val="0"/>
           <w:iCs w:val="0"/>
           <w:smallCaps w:val="0"/>
@@ -894,8 +761,6 @@
         <w:jc w:val="left"/>
         <w:rPr>
           <w:rFonts w:ascii="Arial" w:cs="Arial" w:eastAsia="Arial" w:hAnsi="Arial"/>
-          <w:b w:val="0"/>
-          <w:bCs w:val="0"/>
           <w:i w:val="0"/>
           <w:iCs w:val="0"/>
           <w:smallCaps w:val="0"/>
@@ -957,8 +822,8 @@
           <w:iCs w:val="0"/>
           <w:smallCaps w:val="0"/>
           <w:strike w:val="0"/>
-          <w:sz w:val="22"/>
-          <w:szCs w:val="22"/>
+          <w:sz w:val="24"/>
+          <w:szCs w:val="24"/>
           <w:u w:val="none"/>
           <w:vertAlign w:val="baseline"/>
         </w:rPr>
@@ -972,8 +837,8 @@
           <w:iCs w:val="0"/>
           <w:smallCaps w:val="0"/>
           <w:strike w:val="0"/>
-          <w:sz w:val="22"/>
-          <w:szCs w:val="22"/>
+          <w:sz w:val="24"/>
+          <w:szCs w:val="24"/>
           <w:u w:val="none"/>
           <w:shd w:fill="auto" w:val="clear"/>
           <w:vertAlign w:val="baseline"/>
@@ -984,8 +849,6 @@
       <w:r>
         <w:rPr>
           <w:rFonts w:ascii="Arial" w:cs="Arial" w:eastAsia="Arial" w:hAnsi="Arial"/>
-          <w:b w:val="0"/>
-          <w:bCs w:val="0"/>
           <w:i w:val="0"/>
           <w:iCs w:val="0"/>
           <w:smallCaps w:val="0"/>
@@ -1008,8 +871,8 @@
           <w:iCs w:val="0"/>
           <w:smallCaps w:val="0"/>
           <w:strike w:val="0"/>
-          <w:sz w:val="22"/>
-          <w:szCs w:val="22"/>
+          <w:sz w:val="24"/>
+          <w:szCs w:val="24"/>
           <w:u w:val="none"/>
           <w:shd w:fill="auto" w:val="clear"/>
           <w:vertAlign w:val="baseline"/>
@@ -1019,11 +882,11 @@
       </w:r>
       <w:r>
         <w:rPr>
-          <w:rFonts w:ascii="Consolas" w:cs="Consolas" w:eastAsia="Consolas" w:hAnsi="Consolas"/>
-          <w:b w:val="1"/>
-          <w:bCs w:val="1"/>
-          <w:sz w:val="21"/>
-          <w:szCs w:val="21"/>
+          <w:rFonts w:ascii="Arial" w:cs="Arial" w:eastAsia="Arial" w:hAnsi="Arial"/>
+          <w:b w:val="1"/>
+          <w:bCs w:val="1"/>
+          <w:sz w:val="24"/>
+          <w:szCs w:val="24"/>
           <w:rtl w:val="0"/>
         </w:rPr>
         <w:t xml:space="preserve">[[Nombre]]</w:t>
@@ -1111,8 +974,6 @@
       <w:r>
         <w:rPr>
           <w:rFonts w:ascii="Arial" w:cs="Arial" w:eastAsia="Arial" w:hAnsi="Arial"/>
-          <w:b w:val="0"/>
-          <w:bCs w:val="0"/>
           <w:i w:val="0"/>
           <w:iCs w:val="0"/>
           <w:smallCaps w:val="0"/>
@@ -1127,12 +988,20 @@
         <w:t xml:space="preserve">C.C. No. 52.705.312</w:t>
         <w:tab/>
         <w:t xml:space="preserve">                     </w:t>
-      </w:r>
-      <w:r>
-        <w:rPr>
-          <w:rFonts w:ascii="Arial" w:cs="Arial" w:eastAsia="Arial" w:hAnsi="Arial"/>
-          <w:b w:val="0"/>
-          <w:bCs w:val="0"/>
+        <w:tab/>
+      </w:r>
+      <w:r>
+        <w:rPr>
+          <w:rFonts w:ascii="Arial" w:cs="Arial" w:eastAsia="Arial" w:hAnsi="Arial"/>
+          <w:sz w:val="24"/>
+          <w:szCs w:val="24"/>
+          <w:rtl w:val="0"/>
+        </w:rPr>
+        <w:t xml:space="preserve">    </w:t>
+      </w:r>
+      <w:r>
+        <w:rPr>
+          <w:rFonts w:ascii="Arial" w:cs="Arial" w:eastAsia="Arial" w:hAnsi="Arial"/>
           <w:i w:val="0"/>
           <w:iCs w:val="0"/>
           <w:smallCaps w:val="0"/>
@@ -1144,33 +1013,15 @@
           <w:vertAlign w:val="baseline"/>
           <w:rtl w:val="0"/>
         </w:rPr>
-        <w:t xml:space="preserve">C.C. GNo.</w:t>
-      </w:r>
-      <w:r>
-        <w:rPr>
-          <w:rFonts w:ascii="Century Gothic" w:cs="Century Gothic" w:eastAsia="Century Gothic" w:hAnsi="Century Gothic"/>
-          <w:b w:val="0"/>
-          <w:bCs w:val="0"/>
-          <w:i w:val="0"/>
-          <w:iCs w:val="0"/>
-          <w:smallCaps w:val="0"/>
-          <w:strike w:val="0"/>
-          <w:sz w:val="24"/>
-          <w:szCs w:val="24"/>
-          <w:highlight w:val="lightGray"/>
-          <w:u w:val="none"/>
-          <w:vertAlign w:val="baseline"/>
-          <w:rtl w:val="0"/>
-        </w:rPr>
-        <w:t xml:space="preserve"> </w:t>
-      </w:r>
-      <w:r>
-        <w:rPr>
-          <w:rFonts w:ascii="Consolas" w:cs="Consolas" w:eastAsia="Consolas" w:hAnsi="Consolas"/>
-          <w:b w:val="1"/>
-          <w:bCs w:val="1"/>
-          <w:sz w:val="21"/>
-          <w:szCs w:val="21"/>
+        <w:t xml:space="preserve">C.C. GNo. </w:t>
+      </w:r>
+      <w:r>
+        <w:rPr>
+          <w:rFonts w:ascii="Arial" w:cs="Arial" w:eastAsia="Arial" w:hAnsi="Arial"/>
+          <w:b w:val="1"/>
+          <w:bCs w:val="1"/>
+          <w:sz w:val="24"/>
+          <w:szCs w:val="24"/>
           <w:rtl w:val="0"/>
         </w:rPr>
         <w:t xml:space="preserve">[[Cedula]]</w:t>
@@ -1200,8 +1051,6 @@
         <w:jc w:val="both"/>
         <w:rPr>
           <w:rFonts w:ascii="Arial" w:cs="Arial" w:eastAsia="Arial" w:hAnsi="Arial"/>
-          <w:b w:val="0"/>
-          <w:bCs w:val="0"/>
           <w:i w:val="0"/>
           <w:iCs w:val="0"/>
           <w:smallCaps w:val="0"/>
@@ -1216,8 +1065,6 @@
       <w:r>
         <w:rPr>
           <w:rFonts w:ascii="Arial" w:cs="Arial" w:eastAsia="Arial" w:hAnsi="Arial"/>
-          <w:b w:val="0"/>
-          <w:bCs w:val="0"/>
           <w:i w:val="0"/>
           <w:iCs w:val="0"/>
           <w:smallCaps w:val="0"/>

</xml_diff>